<commit_message>
Deliver offline A0 acceptance and personal report
</commit_message>
<xml_diff>
--- a/reports/个人实验报告.docx
+++ b/reports/个人实验报告.docx
@@ -255,7 +255,7 @@
             <w:pPr>
               <w:spacing w:after="40" w:before="40" w:line="276" w:lineRule="auto"/>
               <w:ind w:firstLine="0"/>
-              <w:jc w:val="left"/>
+              <w:jc w:val="center"/>
             </w:pPr>
             <w:r>
               <w:rPr>
@@ -264,7 +264,7 @@
                 <w:color w:val="000000"/>
                 <w:sz w:val="19"/>
               </w:rPr>
-              <w:t>________________</w:t>
+              <w:t>周新永</w:t>
             </w:r>
           </w:p>
         </w:tc>
@@ -318,7 +318,7 @@
             <w:pPr>
               <w:spacing w:after="40" w:before="40" w:line="276" w:lineRule="auto"/>
               <w:ind w:firstLine="0"/>
-              <w:jc w:val="left"/>
+              <w:jc w:val="center"/>
             </w:pPr>
             <w:r>
               <w:rPr>
@@ -327,7 +327,7 @@
                 <w:color w:val="000000"/>
                 <w:sz w:val="19"/>
               </w:rPr>
-              <w:t>________________</w:t>
+              <w:t>M202674502</w:t>
             </w:r>
           </w:p>
         </w:tc>
@@ -1606,7 +1606,7 @@
                 <w:color w:val="000000"/>
                 <w:sz w:val="18"/>
               </w:rPr>
-              <w:t>代码测试</w:t>
+              <w:t>10月19日代码测试</w:t>
             </w:r>
           </w:p>
         </w:tc>
@@ -3228,7 +3228,7 @@
           <w:color w:val="000000"/>
           <w:sz w:val="21"/>
         </w:rPr>
-        <w:t>自动测试结果为 161 passed in 3.80s。输入文件哈希和源码哈希分别保存于 data_manifest.json 和 source_hashes.json；status.json 记载 complete。测试集基线覆盖 370/370 题，预测覆盖率为 100.00%。</w:t>
+        <w:t>10月19日自动测试结果为 161 passed in 3.80s。输入文件哈希和源码哈希分别保存于 data_manifest.json 和 source_hashes.json；status.json 记载 complete。测试集基线覆盖 370/370 题，预测覆盖率为 100.00%。</w:t>
       </w:r>
     </w:p>
     <w:p>
@@ -7831,7 +7831,7 @@
           <w:color w:val="000000"/>
           <w:sz w:val="21"/>
         </w:rPr>
-        <w:t>本次自动测试 161 项通过，覆盖实体链接、指标输入校验、预测覆盖、配对抽样、个人运行协议及相关工具。测试支持实现行为符合预期，不能代替模型泛化实验。</w:t>
+        <w:t>10月19日自动测试 161 项通过，覆盖实体链接、指标输入校验、预测覆盖、配对抽样、个人运行协议及相关工具。测试支持实现行为符合预期，不能代替模型泛化实验。</w:t>
       </w:r>
     </w:p>
     <w:p>
@@ -7873,7 +7873,49 @@
           <w:color w:val="000000"/>
           <w:sz w:val="21"/>
         </w:rPr>
-        <w:t>人工评分结果：准确性 ______；完整性 ______；流畅度 ______；无依据断言 ______；实际评审题数 ______；评审日期 ______。真实终端截图、个人信息和此项主观评审完成后，方可按课程要求形成最终提交版。</w:t>
+        <w:t>人工评分结果：准确性 ______；完整性 ______；流畅度 ______；无依据断言 ______；实际评审题数 ______；评审日期 ______。真实终端截图、班级信息和此项主观评审完成后，方可按课程要求形成最终提交版。</w:t>
+      </w:r>
+    </w:p>
+    <w:p>
+      <w:pPr>
+        <w:pStyle w:val="Heading3"/>
+      </w:pPr>
+      <w:r>
+        <w:rPr>
+          <w:rFonts w:ascii="Arial" w:hAnsi="Arial" w:cs="Arial" w:eastAsia="黑体"/>
+          <w:b/>
+          <w:color w:val="000000"/>
+          <w:sz w:val="24"/>
+        </w:rPr>
+        <w:t>交付升级记录</w:t>
+      </w:r>
+    </w:p>
+    <w:p>
+      <w:pPr>
+        <w:widowControl/>
+      </w:pPr>
+      <w:r>
+        <w:rPr>
+          <w:rFonts w:ascii="Arial" w:hAnsi="Arial" w:cs="Arial" w:eastAsia="宋体"/>
+          <w:b w:val="0"/>
+          <w:color w:val="000000"/>
+          <w:sz w:val="19"/>
+        </w:rPr>
+        <w:t>2026年10月24日交付升级：新增离线端到端验收和个人模型演示参数，修复未知数字续集误命中原片并加入回归测试。 2026年10月24日在全新隔离CPU环境、仅代码副本中执行，181项测试通过，耗时14.57秒；语法与致命代码检查通过。python -m kgqa.acceptance --output-dir output/acceptance/review 实际返回PASS；13项检查全部通过。10部虚构电影按6/2/2划分，150道题，完整测试30题；四种关系、多答案、别名、拒答、模型重载及15次参数对照已通过。个人模型路径演示成功。该夹具只验证代码行为，不计入200部Wikidata电影的实验成绩。 验收使用合成小夹具，只检查软件流程，不计入10月19日的 Wikidata 实验，也不替代真实截图或人工评分。</w:t>
+      </w:r>
+    </w:p>
+    <w:p>
+      <w:pPr>
+        <w:widowControl/>
+      </w:pPr>
+      <w:r>
+        <w:rPr>
+          <w:rFonts w:ascii="Arial" w:hAnsi="Arial" w:cs="Arial" w:eastAsia="宋体"/>
+          <w:b w:val="0"/>
+          <w:color w:val="000000"/>
+          <w:sz w:val="18"/>
+        </w:rPr>
+        <w:t>离线验收及个人模型演示的操作说明见 docs/提交验收说明.md。</w:t>
       </w:r>
     </w:p>
     <w:p>
@@ -8446,7 +8488,7 @@
                 <w:color w:val="000000"/>
                 <w:sz w:val="17"/>
               </w:rPr>
-              <w:t>真实终端截图与个人信息</w:t>
+              <w:t>真实终端截图与班级</w:t>
             </w:r>
           </w:p>
         </w:tc>
@@ -8504,7 +8546,7 @@
                 <w:color w:val="000000"/>
                 <w:sz w:val="17"/>
               </w:rPr>
-              <w:t>本人采集真实窗口并填写身份字段</w:t>
+              <w:t>本人采集真实窗口并填写班级</w:t>
             </w:r>
           </w:p>
         </w:tc>
@@ -8538,13 +8580,42 @@
                 <w:color w:val="000000"/>
                 <w:sz w:val="17"/>
               </w:rPr>
-              <w:t>个人贡献理解与复核</w:t>
+              <w:t>10月24日交付验收</w:t>
             </w:r>
           </w:p>
         </w:tc>
         <w:tc>
           <w:tcPr>
             <w:tcW w:type="dxa" w:w="3572"/>
+            <w:vAlign w:val="center"/>
+            <w:tcMar>
+              <w:top w:w="85" w:type="dxa"/>
+              <w:left w:w="85" w:type="dxa"/>
+              <w:bottom w:w="85" w:type="dxa"/>
+              <w:right w:w="85" w:type="dxa"/>
+            </w:tcMar>
+            <w:shd w:fill="F6F7F8"/>
+          </w:tcPr>
+          <w:p>
+            <w:pPr>
+              <w:spacing w:after="40" w:before="40" w:line="276" w:lineRule="auto"/>
+              <w:ind w:firstLine="0"/>
+              <w:jc w:val="left"/>
+            </w:pPr>
+            <w:r>
+              <w:rPr>
+                <w:rFonts w:ascii="Arial" w:hAnsi="Arial" w:cs="Arial" w:eastAsia="宋体"/>
+                <w:b w:val="0"/>
+                <w:color w:val="000000"/>
+                <w:sz w:val="17"/>
+              </w:rPr>
+              <w:t>2026年10月24日在全新隔离CPU环境、仅代码副本中执行，181项测试通过，耗时14.57秒；语法与致命代码检查通过。</w:t>
+            </w:r>
+          </w:p>
+        </w:tc>
+        <w:tc>
+          <w:tcPr>
+            <w:tcW w:type="dxa" w:w="3458"/>
             <w:vAlign w:val="center"/>
             <w:tcMar>
               <w:top w:w="85" w:type="dxa"/>
@@ -8567,36 +8638,7 @@
                 <w:color w:val="000000"/>
                 <w:sz w:val="17"/>
               </w:rPr>
-              <w:t>代码与数值可逐项核验</w:t>
-            </w:r>
-          </w:p>
-        </w:tc>
-        <w:tc>
-          <w:tcPr>
-            <w:tcW w:type="dxa" w:w="3458"/>
-            <w:vAlign w:val="center"/>
-            <w:tcMar>
-              <w:top w:w="85" w:type="dxa"/>
-              <w:left w:w="85" w:type="dxa"/>
-              <w:bottom w:w="85" w:type="dxa"/>
-              <w:right w:w="85" w:type="dxa"/>
-            </w:tcMar>
-            <w:shd w:fill="F6F7F8"/>
-          </w:tcPr>
-          <w:p>
-            <w:pPr>
-              <w:spacing w:after="40" w:before="40" w:line="276" w:lineRule="auto"/>
-              <w:ind w:firstLine="0"/>
-              <w:jc w:val="left"/>
-            </w:pPr>
-            <w:r>
-              <w:rPr>
-                <w:rFonts w:ascii="Arial" w:hAnsi="Arial" w:cs="Arial" w:eastAsia="宋体"/>
-                <w:b w:val="0"/>
-                <w:color w:val="000000"/>
-                <w:sz w:val="17"/>
-              </w:rPr>
-              <w:t>本人阅读差异并准备说明失败案例</w:t>
+              <w:t>合成夹具只验证软件流程</w:t>
             </w:r>
           </w:p>
         </w:tc>

</xml_diff>